<commit_message>
feat: detalhamento das regras de negócio do fluxo de pagamento
</commit_message>
<xml_diff>
--- a/DRE UniService - Entrega Final Consolidada.docx
+++ b/DRE UniService - Entrega Final Consolidada.docx
@@ -10,17 +10,6 @@
       <w:r>
         <w:t xml:space="preserve">DOCUMENTO DE REQUISITOS </w:t>
       </w:r>
-      <w:r>
-        <w:t>–</w:t>
-      </w:r>
-      <w:r>
-        <w:t xml:space="preserve"> </w:t>
-      </w:r>
-      <w:proofErr w:type="spellStart"/>
-      <w:r>
-        <w:t>UniService</w:t>
-      </w:r>
-      <w:proofErr w:type="spellEnd"/>
     </w:p>
     <w:p/>
     <w:p>
@@ -54,18 +43,8 @@
           <w:sz w:val="24"/>
           <w:szCs w:val="24"/>
         </w:rPr>
-        <w:t xml:space="preserve"> </w:t>
-      </w:r>
-      <w:proofErr w:type="spellStart"/>
-      <w:r>
-        <w:rPr>
-          <w:rFonts w:ascii="Times New Roman" w:hAnsi="Times New Roman" w:cs="Times New Roman"/>
-          <w:sz w:val="24"/>
-          <w:szCs w:val="24"/>
-        </w:rPr>
-        <w:t>UniService</w:t>
-      </w:r>
-      <w:proofErr w:type="spellEnd"/>
+        <w:t xml:space="preserve"> UniService</w:t>
+      </w:r>
     </w:p>
     <w:p>
       <w:pPr>
@@ -100,6 +79,14 @@
         </w:rPr>
         <w:t xml:space="preserve"> Comunidade Universitária</w:t>
       </w:r>
+      <w:r>
+        <w:rPr>
+          <w:rFonts w:ascii="Times New Roman" w:hAnsi="Times New Roman" w:cs="Times New Roman"/>
+          <w:sz w:val="24"/>
+          <w:szCs w:val="24"/>
+        </w:rPr>
+        <w:t xml:space="preserve"> Itajubense</w:t>
+      </w:r>
     </w:p>
     <w:p>
       <w:pPr>
@@ -198,25 +185,7 @@
           <w:sz w:val="24"/>
           <w:szCs w:val="24"/>
         </w:rPr>
-        <w:t xml:space="preserve">O </w:t>
-      </w:r>
-      <w:proofErr w:type="spellStart"/>
-      <w:r>
-        <w:rPr>
-          <w:rFonts w:ascii="Times New Roman" w:hAnsi="Times New Roman" w:cs="Times New Roman"/>
-          <w:sz w:val="24"/>
-          <w:szCs w:val="24"/>
-        </w:rPr>
-        <w:t>UniService</w:t>
-      </w:r>
-      <w:proofErr w:type="spellEnd"/>
-      <w:r>
-        <w:rPr>
-          <w:rFonts w:ascii="Times New Roman" w:hAnsi="Times New Roman" w:cs="Times New Roman"/>
-          <w:sz w:val="24"/>
-          <w:szCs w:val="24"/>
-        </w:rPr>
-        <w:t xml:space="preserve"> é uma plataforma mobile de intermediação de serviços domésticos que conecta profissionais autônomos (limpeza, elétrica, jardinagem, etc.) a clientes (estudantes e moradores) em busca de praticidade e segurança no ambiente universitário de Itajubá.</w:t>
+        <w:t>O UniService é uma plataforma mobile de intermediação de serviços domésticos que conecta profissionais autônomos (limpeza, elétrica, jardinagem, etc.) a clientes (estudantes e moradores) em busca de praticidade e segurança no ambiente universitário de Itajubá.</w:t>
       </w:r>
     </w:p>
     <w:p>
@@ -389,21 +358,7 @@
         <w:rPr>
           <w:rFonts w:ascii="Times New Roman" w:hAnsi="Times New Roman" w:cs="Times New Roman"/>
         </w:rPr>
-        <w:t xml:space="preserve">2 Entrega de Valor (Problemas a </w:t>
-      </w:r>
-      <w:proofErr w:type="gramStart"/>
-      <w:r>
-        <w:rPr>
-          <w:rFonts w:ascii="Times New Roman" w:hAnsi="Times New Roman" w:cs="Times New Roman"/>
-        </w:rPr>
-        <w:t>serem Resolvidos</w:t>
-      </w:r>
-      <w:proofErr w:type="gramEnd"/>
-      <w:r>
-        <w:rPr>
-          <w:rFonts w:ascii="Times New Roman" w:hAnsi="Times New Roman" w:cs="Times New Roman"/>
-        </w:rPr>
-        <w:t>)</w:t>
+        <w:t>2 Entrega de Valor (Problemas a serem Resolvidos)</w:t>
       </w:r>
     </w:p>
     <w:p>
@@ -525,25 +480,7 @@
           <w:sz w:val="24"/>
           <w:szCs w:val="24"/>
         </w:rPr>
-        <w:t xml:space="preserve">Falta de Padronização: Estabelece um fluxo claro de check-in, </w:t>
-      </w:r>
-      <w:proofErr w:type="spellStart"/>
-      <w:r>
-        <w:rPr>
-          <w:rFonts w:ascii="Times New Roman" w:hAnsi="Times New Roman" w:cs="Times New Roman"/>
-          <w:sz w:val="24"/>
-          <w:szCs w:val="24"/>
-        </w:rPr>
-        <w:t>check-out</w:t>
-      </w:r>
-      <w:proofErr w:type="spellEnd"/>
-      <w:r>
-        <w:rPr>
-          <w:rFonts w:ascii="Times New Roman" w:hAnsi="Times New Roman" w:cs="Times New Roman"/>
-          <w:sz w:val="24"/>
-          <w:szCs w:val="24"/>
-        </w:rPr>
-        <w:t xml:space="preserve"> e avaliações.</w:t>
+        <w:t>Falta de Padronização: Estabelece um fluxo claro de check-in, check-out e avaliações.</w:t>
       </w:r>
     </w:p>
     <w:p>
@@ -715,7 +652,6 @@
         <w:rPr>
           <w:rFonts w:ascii="Times New Roman" w:hAnsi="Times New Roman" w:cs="Times New Roman"/>
         </w:rPr>
-        <w:lastRenderedPageBreak/>
         <w:t>2. Requisitos Funcionais de Cliente (RFC)</w:t>
       </w:r>
     </w:p>
@@ -1340,7 +1276,6 @@
         <w:rPr>
           <w:rFonts w:ascii="Times New Roman" w:hAnsi="Times New Roman" w:cs="Times New Roman"/>
         </w:rPr>
-        <w:lastRenderedPageBreak/>
         <w:t>3. Requisitos Funcionais de Sistema (RFS) - Decomposição Técnica</w:t>
       </w:r>
     </w:p>
@@ -1368,6 +1303,7 @@
           <w:sz w:val="24"/>
           <w:szCs w:val="24"/>
         </w:rPr>
+        <w:lastRenderedPageBreak/>
         <w:t>Abaixo, 5 requisitos de cliente foram decompostos seguindo as normas de CRUD e Inteligência de Sistema:</w:t>
       </w:r>
     </w:p>
@@ -1667,25 +1603,7 @@
                 <w:sz w:val="24"/>
                 <w:szCs w:val="24"/>
               </w:rPr>
-              <w:t xml:space="preserve">Seleção em lista fechada (Limpeza, </w:t>
-            </w:r>
-            <w:proofErr w:type="gramStart"/>
-            <w:r>
-              <w:rPr>
-                <w:rFonts w:ascii="Times New Roman" w:hAnsi="Times New Roman" w:cs="Times New Roman"/>
-                <w:sz w:val="24"/>
-                <w:szCs w:val="24"/>
-              </w:rPr>
-              <w:t>Elétrica</w:t>
-            </w:r>
-            <w:proofErr w:type="gramEnd"/>
-            <w:r>
-              <w:rPr>
-                <w:rFonts w:ascii="Times New Roman" w:hAnsi="Times New Roman" w:cs="Times New Roman"/>
-                <w:sz w:val="24"/>
-                <w:szCs w:val="24"/>
-              </w:rPr>
-              <w:t>, etc.).</w:t>
+              <w:t>Seleção em lista fechada (Limpeza, Elétrica, etc.).</w:t>
             </w:r>
           </w:p>
         </w:tc>
@@ -1789,9 +1707,41 @@
           <w:sz w:val="24"/>
           <w:szCs w:val="24"/>
         </w:rPr>
-        <w:t>Prioridade: [X</w:t>
-      </w:r>
-      <w:proofErr w:type="gramStart"/>
+        <w:t>Prioridade: [X] Essencial</w:t>
+      </w:r>
+    </w:p>
+    <w:p>
+      <w:pPr>
+        <w:pStyle w:val="Heading3"/>
+        <w:spacing w:before="0"/>
+        <w:jc w:val="both"/>
+        <w:rPr>
+          <w:rFonts w:ascii="Times New Roman" w:hAnsi="Times New Roman" w:cs="Times New Roman"/>
+        </w:rPr>
+      </w:pPr>
+      <w:r>
+        <w:rPr>
+          <w:rFonts w:ascii="Times New Roman" w:hAnsi="Times New Roman" w:cs="Times New Roman"/>
+        </w:rPr>
+        <w:t>[RFS02] Consultar Profissional (Derivado do RFC03 - CRUD)</w:t>
+      </w:r>
+    </w:p>
+    <w:p>
+      <w:pPr>
+        <w:pBdr>
+          <w:top w:val="nil"/>
+          <w:left w:val="nil"/>
+          <w:bottom w:val="nil"/>
+          <w:right w:val="nil"/>
+          <w:between w:val="nil"/>
+        </w:pBdr>
+        <w:jc w:val="both"/>
+        <w:rPr>
+          <w:rFonts w:ascii="Times New Roman" w:hAnsi="Times New Roman" w:cs="Times New Roman"/>
+          <w:sz w:val="24"/>
+          <w:szCs w:val="24"/>
+        </w:rPr>
+      </w:pPr>
       <w:r>
         <w:rPr>
           <w:rFonts w:ascii="Times New Roman" w:hAnsi="Times New Roman" w:cs="Times New Roman"/>
@@ -1800,9 +1750,154 @@
           <w:sz w:val="24"/>
           <w:szCs w:val="24"/>
         </w:rPr>
-        <w:t>] Essencial</w:t>
-      </w:r>
-      <w:proofErr w:type="gramEnd"/>
+        <w:t>Atores:</w:t>
+      </w:r>
+      <w:r>
+        <w:rPr>
+          <w:rFonts w:ascii="Times New Roman" w:hAnsi="Times New Roman" w:cs="Times New Roman"/>
+          <w:sz w:val="24"/>
+          <w:szCs w:val="24"/>
+        </w:rPr>
+        <w:t xml:space="preserve"> Cliente, Sistema</w:t>
+      </w:r>
+    </w:p>
+    <w:p>
+      <w:pPr>
+        <w:pBdr>
+          <w:top w:val="nil"/>
+          <w:left w:val="nil"/>
+          <w:bottom w:val="nil"/>
+          <w:right w:val="nil"/>
+          <w:between w:val="nil"/>
+        </w:pBdr>
+        <w:jc w:val="both"/>
+        <w:rPr>
+          <w:rFonts w:ascii="Times New Roman" w:hAnsi="Times New Roman" w:cs="Times New Roman"/>
+          <w:sz w:val="24"/>
+          <w:szCs w:val="24"/>
+        </w:rPr>
+      </w:pPr>
+    </w:p>
+    <w:p>
+      <w:pPr>
+        <w:pBdr>
+          <w:top w:val="nil"/>
+          <w:left w:val="nil"/>
+          <w:bottom w:val="nil"/>
+          <w:right w:val="nil"/>
+          <w:between w:val="nil"/>
+        </w:pBdr>
+        <w:jc w:val="both"/>
+        <w:rPr>
+          <w:rFonts w:ascii="Times New Roman" w:hAnsi="Times New Roman" w:cs="Times New Roman"/>
+          <w:sz w:val="24"/>
+          <w:szCs w:val="24"/>
+        </w:rPr>
+      </w:pPr>
+      <w:r>
+        <w:rPr>
+          <w:rFonts w:ascii="Times New Roman" w:hAnsi="Times New Roman" w:cs="Times New Roman"/>
+          <w:sz w:val="24"/>
+          <w:szCs w:val="24"/>
+        </w:rPr>
+        <w:t xml:space="preserve">O sistema deve realizar a filtragem por categoria e </w:t>
+      </w:r>
+      <w:r>
+        <w:rPr>
+          <w:rFonts w:ascii="Times New Roman" w:hAnsi="Times New Roman" w:cs="Times New Roman"/>
+          <w:sz w:val="24"/>
+          <w:szCs w:val="24"/>
+        </w:rPr>
+        <w:t>status ativo</w:t>
+      </w:r>
+      <w:r>
+        <w:rPr>
+          <w:rFonts w:ascii="Times New Roman" w:hAnsi="Times New Roman" w:cs="Times New Roman"/>
+          <w:sz w:val="24"/>
+          <w:szCs w:val="24"/>
+        </w:rPr>
+        <w:t xml:space="preserve">. Os resultados devem ser agrupados por especialidade e ordenados pela </w:t>
+      </w:r>
+      <w:r>
+        <w:rPr>
+          <w:rFonts w:ascii="Times New Roman" w:hAnsi="Times New Roman" w:cs="Times New Roman"/>
+          <w:sz w:val="24"/>
+          <w:szCs w:val="24"/>
+        </w:rPr>
+        <w:t>média</w:t>
+      </w:r>
+      <w:r>
+        <w:rPr>
+          <w:rFonts w:ascii="Times New Roman" w:hAnsi="Times New Roman" w:cs="Times New Roman"/>
+          <w:sz w:val="24"/>
+          <w:szCs w:val="24"/>
+        </w:rPr>
+        <w:t xml:space="preserve"> </w:t>
+      </w:r>
+      <w:r>
+        <w:rPr>
+          <w:rFonts w:ascii="Times New Roman" w:hAnsi="Times New Roman" w:cs="Times New Roman"/>
+          <w:sz w:val="24"/>
+          <w:szCs w:val="24"/>
+        </w:rPr>
+        <w:t>avaliação</w:t>
+      </w:r>
+      <w:r>
+        <w:rPr>
+          <w:rFonts w:ascii="Times New Roman" w:hAnsi="Times New Roman" w:cs="Times New Roman"/>
+          <w:sz w:val="24"/>
+          <w:szCs w:val="24"/>
+        </w:rPr>
+        <w:t xml:space="preserve"> decrescente.</w:t>
+      </w:r>
+    </w:p>
+    <w:p>
+      <w:pPr>
+        <w:pBdr>
+          <w:top w:val="nil"/>
+          <w:left w:val="nil"/>
+          <w:bottom w:val="nil"/>
+          <w:right w:val="nil"/>
+          <w:between w:val="nil"/>
+        </w:pBdr>
+        <w:ind w:firstLine="720"/>
+        <w:jc w:val="both"/>
+        <w:rPr>
+          <w:rFonts w:ascii="Times New Roman" w:hAnsi="Times New Roman" w:cs="Times New Roman"/>
+          <w:sz w:val="24"/>
+          <w:szCs w:val="24"/>
+        </w:rPr>
+      </w:pPr>
+    </w:p>
+    <w:p>
+      <w:pPr>
+        <w:pBdr>
+          <w:top w:val="nil"/>
+          <w:left w:val="nil"/>
+          <w:bottom w:val="nil"/>
+          <w:right w:val="nil"/>
+          <w:between w:val="nil"/>
+        </w:pBdr>
+        <w:spacing w:after="240"/>
+        <w:jc w:val="both"/>
+        <w:rPr>
+          <w:rFonts w:ascii="Times New Roman" w:hAnsi="Times New Roman" w:cs="Times New Roman"/>
+          <w:b/>
+          <w:bCs/>
+          <w:sz w:val="24"/>
+          <w:szCs w:val="24"/>
+        </w:rPr>
+      </w:pPr>
+      <w:r>
+        <w:rPr>
+          <w:rFonts w:ascii="Times New Roman" w:hAnsi="Times New Roman" w:cs="Times New Roman"/>
+          <w:b/>
+          <w:bCs/>
+          <w:sz w:val="24"/>
+          <w:szCs w:val="24"/>
+        </w:rPr>
+        <w:t>Prioridade: [X] Essencial</w:t>
+      </w:r>
     </w:p>
     <w:p>
       <w:pPr>
@@ -1817,7 +1912,7 @@
         <w:rPr>
           <w:rFonts w:ascii="Times New Roman" w:hAnsi="Times New Roman" w:cs="Times New Roman"/>
         </w:rPr>
-        <w:t>[RFS02] Consultar Profissional (Derivado do RFC03 - CRUD)</w:t>
+        <w:t>[RFS03] Alterar Dados do Perfil (Derivado do RFC10 - CRUD)</w:t>
       </w:r>
     </w:p>
     <w:p>
@@ -1852,109 +1947,60 @@
           <w:sz w:val="24"/>
           <w:szCs w:val="24"/>
         </w:rPr>
-        <w:t xml:space="preserve"> Cliente, Sistema</w:t>
-      </w:r>
-    </w:p>
-    <w:p>
-      <w:pPr>
-        <w:pBdr>
-          <w:top w:val="nil"/>
-          <w:left w:val="nil"/>
-          <w:bottom w:val="nil"/>
-          <w:right w:val="nil"/>
-          <w:between w:val="nil"/>
-        </w:pBdr>
-        <w:jc w:val="both"/>
-        <w:rPr>
-          <w:rFonts w:ascii="Times New Roman" w:hAnsi="Times New Roman" w:cs="Times New Roman"/>
-          <w:sz w:val="24"/>
-          <w:szCs w:val="24"/>
-        </w:rPr>
-      </w:pPr>
-    </w:p>
-    <w:p>
-      <w:pPr>
-        <w:pBdr>
-          <w:top w:val="nil"/>
-          <w:left w:val="nil"/>
-          <w:bottom w:val="nil"/>
-          <w:right w:val="nil"/>
-          <w:between w:val="nil"/>
-        </w:pBdr>
-        <w:jc w:val="both"/>
-        <w:rPr>
-          <w:rFonts w:ascii="Times New Roman" w:hAnsi="Times New Roman" w:cs="Times New Roman"/>
-          <w:sz w:val="24"/>
-          <w:szCs w:val="24"/>
-        </w:rPr>
-      </w:pPr>
-      <w:r>
-        <w:rPr>
-          <w:rFonts w:ascii="Times New Roman" w:hAnsi="Times New Roman" w:cs="Times New Roman"/>
-          <w:sz w:val="24"/>
-          <w:szCs w:val="24"/>
-        </w:rPr>
-        <w:t xml:space="preserve">O sistema deve realizar a filtragem por categoria e </w:t>
-      </w:r>
-      <w:r>
-        <w:rPr>
-          <w:rFonts w:ascii="Times New Roman" w:hAnsi="Times New Roman" w:cs="Times New Roman"/>
-          <w:sz w:val="24"/>
-          <w:szCs w:val="24"/>
-        </w:rPr>
-        <w:t>status ativo</w:t>
-      </w:r>
-      <w:r>
-        <w:rPr>
-          <w:rFonts w:ascii="Times New Roman" w:hAnsi="Times New Roman" w:cs="Times New Roman"/>
-          <w:sz w:val="24"/>
-          <w:szCs w:val="24"/>
-        </w:rPr>
-        <w:t xml:space="preserve">. Os resultados devem ser agrupados por especialidade e ordenados pela </w:t>
-      </w:r>
-      <w:r>
-        <w:rPr>
-          <w:rFonts w:ascii="Times New Roman" w:hAnsi="Times New Roman" w:cs="Times New Roman"/>
-          <w:sz w:val="24"/>
-          <w:szCs w:val="24"/>
-        </w:rPr>
-        <w:t>média</w:t>
-      </w:r>
-      <w:r>
-        <w:rPr>
-          <w:rFonts w:ascii="Times New Roman" w:hAnsi="Times New Roman" w:cs="Times New Roman"/>
-          <w:sz w:val="24"/>
-          <w:szCs w:val="24"/>
-        </w:rPr>
-        <w:t xml:space="preserve"> </w:t>
-      </w:r>
-      <w:r>
-        <w:rPr>
-          <w:rFonts w:ascii="Times New Roman" w:hAnsi="Times New Roman" w:cs="Times New Roman"/>
-          <w:sz w:val="24"/>
-          <w:szCs w:val="24"/>
-        </w:rPr>
-        <w:t>avaliação</w:t>
-      </w:r>
-      <w:r>
-        <w:rPr>
-          <w:rFonts w:ascii="Times New Roman" w:hAnsi="Times New Roman" w:cs="Times New Roman"/>
-          <w:sz w:val="24"/>
-          <w:szCs w:val="24"/>
-        </w:rPr>
-        <w:t xml:space="preserve"> decrescente.</w:t>
-      </w:r>
-    </w:p>
-    <w:p>
-      <w:pPr>
-        <w:pBdr>
-          <w:top w:val="nil"/>
-          <w:left w:val="nil"/>
-          <w:bottom w:val="nil"/>
-          <w:right w:val="nil"/>
-          <w:between w:val="nil"/>
-        </w:pBdr>
-        <w:ind w:firstLine="720"/>
+        <w:t xml:space="preserve"> Profissional, Administrador</w:t>
+      </w:r>
+    </w:p>
+    <w:p>
+      <w:pPr>
+        <w:pBdr>
+          <w:top w:val="nil"/>
+          <w:left w:val="nil"/>
+          <w:bottom w:val="nil"/>
+          <w:right w:val="nil"/>
+          <w:between w:val="nil"/>
+        </w:pBdr>
+        <w:jc w:val="both"/>
+        <w:rPr>
+          <w:rFonts w:ascii="Times New Roman" w:hAnsi="Times New Roman" w:cs="Times New Roman"/>
+          <w:sz w:val="24"/>
+          <w:szCs w:val="24"/>
+        </w:rPr>
+      </w:pPr>
+    </w:p>
+    <w:p>
+      <w:pPr>
+        <w:pBdr>
+          <w:top w:val="nil"/>
+          <w:left w:val="nil"/>
+          <w:bottom w:val="nil"/>
+          <w:right w:val="nil"/>
+          <w:between w:val="nil"/>
+        </w:pBdr>
+        <w:jc w:val="both"/>
+        <w:rPr>
+          <w:rFonts w:ascii="Times New Roman" w:hAnsi="Times New Roman" w:cs="Times New Roman"/>
+          <w:sz w:val="24"/>
+          <w:szCs w:val="24"/>
+        </w:rPr>
+      </w:pPr>
+      <w:r>
+        <w:rPr>
+          <w:rFonts w:ascii="Times New Roman" w:hAnsi="Times New Roman" w:cs="Times New Roman"/>
+          <w:sz w:val="24"/>
+          <w:szCs w:val="24"/>
+        </w:rPr>
+        <w:t>Permite a edição de todos os atributos do RFS01, exceto o CPF, que permanece imutável após a validação inicial para garantir a integridade da conta.</w:t>
+      </w:r>
+    </w:p>
+    <w:p>
+      <w:pPr>
+        <w:pBdr>
+          <w:top w:val="nil"/>
+          <w:left w:val="nil"/>
+          <w:bottom w:val="nil"/>
+          <w:right w:val="nil"/>
+          <w:between w:val="nil"/>
+        </w:pBdr>
         <w:jc w:val="both"/>
         <w:rPr>
           <w:rFonts w:ascii="Times New Roman" w:hAnsi="Times New Roman" w:cs="Times New Roman"/>
@@ -1995,6 +2041,26 @@
     </w:p>
     <w:p>
       <w:pPr>
+        <w:pBdr>
+          <w:top w:val="nil"/>
+          <w:left w:val="nil"/>
+          <w:bottom w:val="nil"/>
+          <w:right w:val="nil"/>
+          <w:between w:val="nil"/>
+        </w:pBdr>
+        <w:spacing w:after="240"/>
+        <w:jc w:val="both"/>
+        <w:rPr>
+          <w:rFonts w:ascii="Times New Roman" w:hAnsi="Times New Roman" w:cs="Times New Roman"/>
+          <w:b/>
+          <w:bCs/>
+          <w:sz w:val="24"/>
+          <w:szCs w:val="24"/>
+        </w:rPr>
+      </w:pPr>
+    </w:p>
+    <w:p>
+      <w:pPr>
         <w:pStyle w:val="Heading3"/>
         <w:spacing w:before="0"/>
         <w:jc w:val="both"/>
@@ -2002,11 +2068,21 @@
           <w:rFonts w:ascii="Times New Roman" w:hAnsi="Times New Roman" w:cs="Times New Roman"/>
         </w:rPr>
       </w:pPr>
-      <w:r>
-        <w:rPr>
-          <w:rFonts w:ascii="Times New Roman" w:hAnsi="Times New Roman" w:cs="Times New Roman"/>
-        </w:rPr>
-        <w:t>[RFS03] Alterar Dados do Perfil (Derivado do RFC10 - CRUD)</w:t>
+    </w:p>
+    <w:p>
+      <w:pPr>
+        <w:pStyle w:val="Heading3"/>
+        <w:spacing w:before="0"/>
+        <w:jc w:val="both"/>
+        <w:rPr>
+          <w:rFonts w:ascii="Times New Roman" w:hAnsi="Times New Roman" w:cs="Times New Roman"/>
+        </w:rPr>
+      </w:pPr>
+      <w:r>
+        <w:rPr>
+          <w:rFonts w:ascii="Times New Roman" w:hAnsi="Times New Roman" w:cs="Times New Roman"/>
+        </w:rPr>
+        <w:t>[RFS04] Processar Pagamento e Retenção (Derivado do RFC06 - Inteligência)</w:t>
       </w:r>
     </w:p>
     <w:p>
@@ -2041,78 +2117,77 @@
           <w:sz w:val="24"/>
           <w:szCs w:val="24"/>
         </w:rPr>
-        <w:t xml:space="preserve"> Profissional, Administrador</w:t>
-      </w:r>
-    </w:p>
-    <w:p>
-      <w:pPr>
-        <w:pBdr>
-          <w:top w:val="nil"/>
-          <w:left w:val="nil"/>
-          <w:bottom w:val="nil"/>
-          <w:right w:val="nil"/>
-          <w:between w:val="nil"/>
-        </w:pBdr>
-        <w:jc w:val="both"/>
-        <w:rPr>
-          <w:rFonts w:ascii="Times New Roman" w:hAnsi="Times New Roman" w:cs="Times New Roman"/>
-          <w:sz w:val="24"/>
-          <w:szCs w:val="24"/>
-        </w:rPr>
-      </w:pPr>
-    </w:p>
-    <w:p>
-      <w:pPr>
-        <w:pBdr>
-          <w:top w:val="nil"/>
-          <w:left w:val="nil"/>
-          <w:bottom w:val="nil"/>
-          <w:right w:val="nil"/>
-          <w:between w:val="nil"/>
-        </w:pBdr>
-        <w:jc w:val="both"/>
-        <w:rPr>
-          <w:rFonts w:ascii="Times New Roman" w:hAnsi="Times New Roman" w:cs="Times New Roman"/>
-          <w:sz w:val="24"/>
-          <w:szCs w:val="24"/>
-        </w:rPr>
-      </w:pPr>
-      <w:r>
-        <w:rPr>
-          <w:rFonts w:ascii="Times New Roman" w:hAnsi="Times New Roman" w:cs="Times New Roman"/>
-          <w:sz w:val="24"/>
-          <w:szCs w:val="24"/>
-        </w:rPr>
-        <w:t>Permite a edição de todos os atributos do RFS01, exceto o CPF, que permanece imutável após a validação inicial para garantir a integridade da conta.</w:t>
-      </w:r>
-    </w:p>
-    <w:p>
-      <w:pPr>
-        <w:pBdr>
-          <w:top w:val="nil"/>
-          <w:left w:val="nil"/>
-          <w:bottom w:val="nil"/>
-          <w:right w:val="nil"/>
-          <w:between w:val="nil"/>
-        </w:pBdr>
-        <w:jc w:val="both"/>
-        <w:rPr>
-          <w:rFonts w:ascii="Times New Roman" w:hAnsi="Times New Roman" w:cs="Times New Roman"/>
-          <w:sz w:val="24"/>
-          <w:szCs w:val="24"/>
-        </w:rPr>
-      </w:pPr>
-    </w:p>
-    <w:p>
-      <w:pPr>
-        <w:pBdr>
-          <w:top w:val="nil"/>
-          <w:left w:val="nil"/>
-          <w:bottom w:val="nil"/>
-          <w:right w:val="nil"/>
-          <w:between w:val="nil"/>
-        </w:pBdr>
-        <w:spacing w:after="240"/>
+        <w:t xml:space="preserve"> Sistema, Gateway de Pagamento</w:t>
+      </w:r>
+    </w:p>
+    <w:p>
+      <w:pPr>
+        <w:pBdr>
+          <w:top w:val="nil"/>
+          <w:left w:val="nil"/>
+          <w:bottom w:val="nil"/>
+          <w:right w:val="nil"/>
+          <w:between w:val="nil"/>
+        </w:pBdr>
+        <w:jc w:val="both"/>
+        <w:rPr>
+          <w:rFonts w:ascii="Times New Roman" w:hAnsi="Times New Roman" w:cs="Times New Roman"/>
+          <w:sz w:val="24"/>
+          <w:szCs w:val="24"/>
+        </w:rPr>
+      </w:pPr>
+    </w:p>
+    <w:p>
+      <w:pPr>
+        <w:pBdr>
+          <w:top w:val="nil"/>
+          <w:left w:val="nil"/>
+          <w:bottom w:val="nil"/>
+          <w:right w:val="nil"/>
+          <w:between w:val="nil"/>
+        </w:pBdr>
+        <w:jc w:val="both"/>
+        <w:rPr>
+          <w:rFonts w:ascii="Times New Roman" w:hAnsi="Times New Roman" w:cs="Times New Roman"/>
+          <w:sz w:val="24"/>
+          <w:szCs w:val="24"/>
+        </w:rPr>
+      </w:pPr>
+      <w:r>
+        <w:rPr>
+          <w:rFonts w:ascii="Times New Roman" w:hAnsi="Times New Roman" w:cs="Times New Roman"/>
+          <w:sz w:val="24"/>
+          <w:szCs w:val="24"/>
+        </w:rPr>
+        <w:t>O sistema deve realizar a pré-autorização do valor no método de pagamento selecionado no ato do agendamento. O repasse ao profissional só ocorre após a confirmação do check-out, descontando a taxa da plataforma.</w:t>
+      </w:r>
+    </w:p>
+    <w:p>
+      <w:pPr>
+        <w:pBdr>
+          <w:top w:val="nil"/>
+          <w:left w:val="nil"/>
+          <w:bottom w:val="nil"/>
+          <w:right w:val="nil"/>
+          <w:between w:val="nil"/>
+        </w:pBdr>
+        <w:jc w:val="both"/>
+        <w:rPr>
+          <w:rFonts w:ascii="Times New Roman" w:hAnsi="Times New Roman" w:cs="Times New Roman"/>
+          <w:sz w:val="24"/>
+          <w:szCs w:val="24"/>
+        </w:rPr>
+      </w:pPr>
+    </w:p>
+    <w:p>
+      <w:pPr>
+        <w:pBdr>
+          <w:top w:val="nil"/>
+          <w:left w:val="nil"/>
+          <w:bottom w:val="nil"/>
+          <w:right w:val="nil"/>
+          <w:between w:val="nil"/>
+        </w:pBdr>
         <w:jc w:val="both"/>
         <w:rPr>
           <w:rFonts w:ascii="Times New Roman" w:hAnsi="Times New Roman" w:cs="Times New Roman"/>
@@ -2130,9 +2205,58 @@
           <w:sz w:val="24"/>
           <w:szCs w:val="24"/>
         </w:rPr>
-        <w:t>Prioridade: [X</w:t>
-      </w:r>
-      <w:proofErr w:type="gramStart"/>
+        <w:t>Prioridade: [X] Essencial</w:t>
+      </w:r>
+    </w:p>
+    <w:p>
+      <w:pPr>
+        <w:pBdr>
+          <w:top w:val="nil"/>
+          <w:left w:val="nil"/>
+          <w:bottom w:val="nil"/>
+          <w:right w:val="nil"/>
+          <w:between w:val="nil"/>
+        </w:pBdr>
+        <w:jc w:val="both"/>
+        <w:rPr>
+          <w:rFonts w:ascii="Times New Roman" w:hAnsi="Times New Roman" w:cs="Times New Roman"/>
+          <w:sz w:val="24"/>
+          <w:szCs w:val="24"/>
+        </w:rPr>
+      </w:pPr>
+    </w:p>
+    <w:p>
+      <w:pPr>
+        <w:pStyle w:val="Heading3"/>
+        <w:spacing w:before="0"/>
+        <w:jc w:val="both"/>
+        <w:rPr>
+          <w:rFonts w:ascii="Times New Roman" w:hAnsi="Times New Roman" w:cs="Times New Roman"/>
+        </w:rPr>
+      </w:pPr>
+      <w:r>
+        <w:rPr>
+          <w:rFonts w:ascii="Times New Roman" w:hAnsi="Times New Roman" w:cs="Times New Roman"/>
+        </w:rPr>
+        <w:t>[RFS05] Gerenciar Cancelamento e Multas (Derivado do RFC09 - Inteligência)</w:t>
+      </w:r>
+    </w:p>
+    <w:p>
+      <w:pPr>
+        <w:pBdr>
+          <w:top w:val="nil"/>
+          <w:left w:val="nil"/>
+          <w:bottom w:val="nil"/>
+          <w:right w:val="nil"/>
+          <w:between w:val="nil"/>
+        </w:pBdr>
+        <w:jc w:val="both"/>
+        <w:rPr>
+          <w:rFonts w:ascii="Times New Roman" w:hAnsi="Times New Roman" w:cs="Times New Roman"/>
+          <w:sz w:val="24"/>
+          <w:szCs w:val="24"/>
+        </w:rPr>
+      </w:pPr>
       <w:r>
         <w:rPr>
           <w:rFonts w:ascii="Times New Roman" w:hAnsi="Times New Roman" w:cs="Times New Roman"/>
@@ -2141,20 +2265,85 @@
           <w:sz w:val="24"/>
           <w:szCs w:val="24"/>
         </w:rPr>
-        <w:t>] Essencial</w:t>
-      </w:r>
-      <w:proofErr w:type="gramEnd"/>
-    </w:p>
-    <w:p>
-      <w:pPr>
-        <w:pBdr>
-          <w:top w:val="nil"/>
-          <w:left w:val="nil"/>
-          <w:bottom w:val="nil"/>
-          <w:right w:val="nil"/>
-          <w:between w:val="nil"/>
-        </w:pBdr>
-        <w:spacing w:after="240"/>
+        <w:t>Atores:</w:t>
+      </w:r>
+      <w:r>
+        <w:rPr>
+          <w:rFonts w:ascii="Times New Roman" w:hAnsi="Times New Roman" w:cs="Times New Roman"/>
+          <w:sz w:val="24"/>
+          <w:szCs w:val="24"/>
+        </w:rPr>
+        <w:t xml:space="preserve"> Cliente, Profissional, Sistema</w:t>
+      </w:r>
+    </w:p>
+    <w:p>
+      <w:pPr>
+        <w:pBdr>
+          <w:top w:val="nil"/>
+          <w:left w:val="nil"/>
+          <w:bottom w:val="nil"/>
+          <w:right w:val="nil"/>
+          <w:between w:val="nil"/>
+        </w:pBdr>
+        <w:jc w:val="both"/>
+        <w:rPr>
+          <w:rFonts w:ascii="Times New Roman" w:hAnsi="Times New Roman" w:cs="Times New Roman"/>
+          <w:sz w:val="24"/>
+          <w:szCs w:val="24"/>
+        </w:rPr>
+      </w:pPr>
+    </w:p>
+    <w:p>
+      <w:pPr>
+        <w:pBdr>
+          <w:top w:val="nil"/>
+          <w:left w:val="nil"/>
+          <w:bottom w:val="nil"/>
+          <w:right w:val="nil"/>
+          <w:between w:val="nil"/>
+        </w:pBdr>
+        <w:jc w:val="both"/>
+        <w:rPr>
+          <w:rFonts w:ascii="Times New Roman" w:hAnsi="Times New Roman" w:cs="Times New Roman"/>
+          <w:sz w:val="24"/>
+          <w:szCs w:val="24"/>
+        </w:rPr>
+      </w:pPr>
+      <w:r>
+        <w:rPr>
+          <w:rFonts w:ascii="Times New Roman" w:hAnsi="Times New Roman" w:cs="Times New Roman"/>
+          <w:sz w:val="24"/>
+          <w:szCs w:val="24"/>
+        </w:rPr>
+        <w:t>Caso o cancelamento ocorra em menos de 2 horas do início previsto, o sistema deve processar automaticamente a cobrança de multa administrativa de 20% do valor do serviço.</w:t>
+      </w:r>
+    </w:p>
+    <w:p>
+      <w:pPr>
+        <w:pBdr>
+          <w:top w:val="nil"/>
+          <w:left w:val="nil"/>
+          <w:bottom w:val="nil"/>
+          <w:right w:val="nil"/>
+          <w:between w:val="nil"/>
+        </w:pBdr>
+        <w:jc w:val="both"/>
+        <w:rPr>
+          <w:rFonts w:ascii="Times New Roman" w:hAnsi="Times New Roman" w:cs="Times New Roman"/>
+          <w:sz w:val="24"/>
+          <w:szCs w:val="24"/>
+        </w:rPr>
+      </w:pPr>
+    </w:p>
+    <w:p>
+      <w:pPr>
+        <w:pBdr>
+          <w:top w:val="nil"/>
+          <w:left w:val="nil"/>
+          <w:bottom w:val="nil"/>
+          <w:right w:val="nil"/>
+          <w:between w:val="nil"/>
+        </w:pBdr>
         <w:jc w:val="both"/>
         <w:rPr>
           <w:rFonts w:ascii="Times New Roman" w:hAnsi="Times New Roman" w:cs="Times New Roman"/>
@@ -2164,50 +2353,6 @@
           <w:szCs w:val="24"/>
         </w:rPr>
       </w:pPr>
-    </w:p>
-    <w:p>
-      <w:pPr>
-        <w:pStyle w:val="Heading3"/>
-        <w:spacing w:before="0"/>
-        <w:jc w:val="both"/>
-        <w:rPr>
-          <w:rFonts w:ascii="Times New Roman" w:hAnsi="Times New Roman" w:cs="Times New Roman"/>
-        </w:rPr>
-      </w:pPr>
-    </w:p>
-    <w:p>
-      <w:pPr>
-        <w:pStyle w:val="Heading3"/>
-        <w:spacing w:before="0"/>
-        <w:jc w:val="both"/>
-        <w:rPr>
-          <w:rFonts w:ascii="Times New Roman" w:hAnsi="Times New Roman" w:cs="Times New Roman"/>
-        </w:rPr>
-      </w:pPr>
-      <w:r>
-        <w:rPr>
-          <w:rFonts w:ascii="Times New Roman" w:hAnsi="Times New Roman" w:cs="Times New Roman"/>
-        </w:rPr>
-        <w:lastRenderedPageBreak/>
-        <w:t>[RFS04] Processar Pagamento e Retenção (Derivado do RFC06 - Inteligência)</w:t>
-      </w:r>
-    </w:p>
-    <w:p>
-      <w:pPr>
-        <w:pBdr>
-          <w:top w:val="nil"/>
-          <w:left w:val="nil"/>
-          <w:bottom w:val="nil"/>
-          <w:right w:val="nil"/>
-          <w:between w:val="nil"/>
-        </w:pBdr>
-        <w:jc w:val="both"/>
-        <w:rPr>
-          <w:rFonts w:ascii="Times New Roman" w:hAnsi="Times New Roman" w:cs="Times New Roman"/>
-          <w:sz w:val="24"/>
-          <w:szCs w:val="24"/>
-        </w:rPr>
-      </w:pPr>
       <w:r>
         <w:rPr>
           <w:rFonts w:ascii="Times New Roman" w:hAnsi="Times New Roman" w:cs="Times New Roman"/>
@@ -2216,320 +2361,8 @@
           <w:sz w:val="24"/>
           <w:szCs w:val="24"/>
         </w:rPr>
-        <w:t>Atores:</w:t>
-      </w:r>
-      <w:r>
-        <w:rPr>
-          <w:rFonts w:ascii="Times New Roman" w:hAnsi="Times New Roman" w:cs="Times New Roman"/>
-          <w:sz w:val="24"/>
-          <w:szCs w:val="24"/>
-        </w:rPr>
-        <w:t xml:space="preserve"> Sistema, Gateway de Pagamento</w:t>
-      </w:r>
-    </w:p>
-    <w:p>
-      <w:pPr>
-        <w:pBdr>
-          <w:top w:val="nil"/>
-          <w:left w:val="nil"/>
-          <w:bottom w:val="nil"/>
-          <w:right w:val="nil"/>
-          <w:between w:val="nil"/>
-        </w:pBdr>
-        <w:jc w:val="both"/>
-        <w:rPr>
-          <w:rFonts w:ascii="Times New Roman" w:hAnsi="Times New Roman" w:cs="Times New Roman"/>
-          <w:sz w:val="24"/>
-          <w:szCs w:val="24"/>
-        </w:rPr>
-      </w:pPr>
-    </w:p>
-    <w:p>
-      <w:pPr>
-        <w:pBdr>
-          <w:top w:val="nil"/>
-          <w:left w:val="nil"/>
-          <w:bottom w:val="nil"/>
-          <w:right w:val="nil"/>
-          <w:between w:val="nil"/>
-        </w:pBdr>
-        <w:jc w:val="both"/>
-        <w:rPr>
-          <w:rFonts w:ascii="Times New Roman" w:hAnsi="Times New Roman" w:cs="Times New Roman"/>
-          <w:sz w:val="24"/>
-          <w:szCs w:val="24"/>
-        </w:rPr>
-      </w:pPr>
-      <w:r>
-        <w:rPr>
-          <w:rFonts w:ascii="Times New Roman" w:hAnsi="Times New Roman" w:cs="Times New Roman"/>
-          <w:sz w:val="24"/>
-          <w:szCs w:val="24"/>
-        </w:rPr>
-        <w:t xml:space="preserve">O sistema deve realizar a </w:t>
-      </w:r>
-      <w:proofErr w:type="spellStart"/>
-      <w:r>
-        <w:rPr>
-          <w:rFonts w:ascii="Times New Roman" w:hAnsi="Times New Roman" w:cs="Times New Roman"/>
-          <w:sz w:val="24"/>
-          <w:szCs w:val="24"/>
-        </w:rPr>
-        <w:t>pré</w:t>
-      </w:r>
-      <w:proofErr w:type="spellEnd"/>
-      <w:r>
-        <w:rPr>
-          <w:rFonts w:ascii="Times New Roman" w:hAnsi="Times New Roman" w:cs="Times New Roman"/>
-          <w:sz w:val="24"/>
-          <w:szCs w:val="24"/>
-        </w:rPr>
-        <w:t xml:space="preserve">-autorização do valor no método de pagamento selecionado no ato do agendamento. O repasse ao profissional só ocorre após a confirmação do </w:t>
-      </w:r>
-      <w:proofErr w:type="spellStart"/>
-      <w:r>
-        <w:rPr>
-          <w:rFonts w:ascii="Times New Roman" w:hAnsi="Times New Roman" w:cs="Times New Roman"/>
-          <w:sz w:val="24"/>
-          <w:szCs w:val="24"/>
-        </w:rPr>
-        <w:t>check-out</w:t>
-      </w:r>
-      <w:proofErr w:type="spellEnd"/>
-      <w:r>
-        <w:rPr>
-          <w:rFonts w:ascii="Times New Roman" w:hAnsi="Times New Roman" w:cs="Times New Roman"/>
-          <w:sz w:val="24"/>
-          <w:szCs w:val="24"/>
-        </w:rPr>
-        <w:t>, descontando a taxa da plataforma.</w:t>
-      </w:r>
-    </w:p>
-    <w:p>
-      <w:pPr>
-        <w:pBdr>
-          <w:top w:val="nil"/>
-          <w:left w:val="nil"/>
-          <w:bottom w:val="nil"/>
-          <w:right w:val="nil"/>
-          <w:between w:val="nil"/>
-        </w:pBdr>
-        <w:jc w:val="both"/>
-        <w:rPr>
-          <w:rFonts w:ascii="Times New Roman" w:hAnsi="Times New Roman" w:cs="Times New Roman"/>
-          <w:sz w:val="24"/>
-          <w:szCs w:val="24"/>
-        </w:rPr>
-      </w:pPr>
-    </w:p>
-    <w:p>
-      <w:pPr>
-        <w:pBdr>
-          <w:top w:val="nil"/>
-          <w:left w:val="nil"/>
-          <w:bottom w:val="nil"/>
-          <w:right w:val="nil"/>
-          <w:between w:val="nil"/>
-        </w:pBdr>
-        <w:jc w:val="both"/>
-        <w:rPr>
-          <w:rFonts w:ascii="Times New Roman" w:hAnsi="Times New Roman" w:cs="Times New Roman"/>
-          <w:b/>
-          <w:bCs/>
-          <w:sz w:val="24"/>
-          <w:szCs w:val="24"/>
-        </w:rPr>
-      </w:pPr>
-      <w:r>
-        <w:rPr>
-          <w:rFonts w:ascii="Times New Roman" w:hAnsi="Times New Roman" w:cs="Times New Roman"/>
-          <w:b/>
-          <w:bCs/>
-          <w:sz w:val="24"/>
-          <w:szCs w:val="24"/>
-        </w:rPr>
-        <w:t>Prioridade: [X</w:t>
-      </w:r>
-      <w:proofErr w:type="gramStart"/>
-      <w:r>
-        <w:rPr>
-          <w:rFonts w:ascii="Times New Roman" w:hAnsi="Times New Roman" w:cs="Times New Roman"/>
-          <w:b/>
-          <w:bCs/>
-          <w:sz w:val="24"/>
-          <w:szCs w:val="24"/>
-        </w:rPr>
-        <w:t>] Essencial</w:t>
-      </w:r>
-      <w:proofErr w:type="gramEnd"/>
-    </w:p>
-    <w:p>
-      <w:pPr>
-        <w:pBdr>
-          <w:top w:val="nil"/>
-          <w:left w:val="nil"/>
-          <w:bottom w:val="nil"/>
-          <w:right w:val="nil"/>
-          <w:between w:val="nil"/>
-        </w:pBdr>
-        <w:jc w:val="both"/>
-        <w:rPr>
-          <w:rFonts w:ascii="Times New Roman" w:hAnsi="Times New Roman" w:cs="Times New Roman"/>
-          <w:sz w:val="24"/>
-          <w:szCs w:val="24"/>
-        </w:rPr>
-      </w:pPr>
-    </w:p>
-    <w:p>
-      <w:pPr>
-        <w:pStyle w:val="Heading3"/>
-        <w:spacing w:before="0"/>
-        <w:jc w:val="both"/>
-        <w:rPr>
-          <w:rFonts w:ascii="Times New Roman" w:hAnsi="Times New Roman" w:cs="Times New Roman"/>
-        </w:rPr>
-      </w:pPr>
-      <w:r>
-        <w:rPr>
-          <w:rFonts w:ascii="Times New Roman" w:hAnsi="Times New Roman" w:cs="Times New Roman"/>
-        </w:rPr>
-        <w:t>[RFS05] Gerenciar Cancelamento e Multas (Derivado do RFC09 - Inteligência)</w:t>
-      </w:r>
-    </w:p>
-    <w:p>
-      <w:pPr>
-        <w:pBdr>
-          <w:top w:val="nil"/>
-          <w:left w:val="nil"/>
-          <w:bottom w:val="nil"/>
-          <w:right w:val="nil"/>
-          <w:between w:val="nil"/>
-        </w:pBdr>
-        <w:jc w:val="both"/>
-        <w:rPr>
-          <w:rFonts w:ascii="Times New Roman" w:hAnsi="Times New Roman" w:cs="Times New Roman"/>
-          <w:sz w:val="24"/>
-          <w:szCs w:val="24"/>
-        </w:rPr>
-      </w:pPr>
-      <w:r>
-        <w:rPr>
-          <w:rFonts w:ascii="Times New Roman" w:hAnsi="Times New Roman" w:cs="Times New Roman"/>
-          <w:b/>
-          <w:bCs/>
-          <w:sz w:val="24"/>
-          <w:szCs w:val="24"/>
-        </w:rPr>
-        <w:t>Atores:</w:t>
-      </w:r>
-      <w:r>
-        <w:rPr>
-          <w:rFonts w:ascii="Times New Roman" w:hAnsi="Times New Roman" w:cs="Times New Roman"/>
-          <w:sz w:val="24"/>
-          <w:szCs w:val="24"/>
-        </w:rPr>
-        <w:t xml:space="preserve"> Cliente, Profissional, Sistema</w:t>
-      </w:r>
-    </w:p>
-    <w:p>
-      <w:pPr>
-        <w:pBdr>
-          <w:top w:val="nil"/>
-          <w:left w:val="nil"/>
-          <w:bottom w:val="nil"/>
-          <w:right w:val="nil"/>
-          <w:between w:val="nil"/>
-        </w:pBdr>
-        <w:jc w:val="both"/>
-        <w:rPr>
-          <w:rFonts w:ascii="Times New Roman" w:hAnsi="Times New Roman" w:cs="Times New Roman"/>
-          <w:sz w:val="24"/>
-          <w:szCs w:val="24"/>
-        </w:rPr>
-      </w:pPr>
-    </w:p>
-    <w:p>
-      <w:pPr>
-        <w:pBdr>
-          <w:top w:val="nil"/>
-          <w:left w:val="nil"/>
-          <w:bottom w:val="nil"/>
-          <w:right w:val="nil"/>
-          <w:between w:val="nil"/>
-        </w:pBdr>
-        <w:jc w:val="both"/>
-        <w:rPr>
-          <w:rFonts w:ascii="Times New Roman" w:hAnsi="Times New Roman" w:cs="Times New Roman"/>
-          <w:sz w:val="24"/>
-          <w:szCs w:val="24"/>
-        </w:rPr>
-      </w:pPr>
-      <w:r>
-        <w:rPr>
-          <w:rFonts w:ascii="Times New Roman" w:hAnsi="Times New Roman" w:cs="Times New Roman"/>
-          <w:sz w:val="24"/>
-          <w:szCs w:val="24"/>
-        </w:rPr>
-        <w:t>Caso o cancelamento ocorra em menos de 2 horas do início previsto, o sistema deve processar automaticamente a cobrança de multa administrativa de 20% do valor do serviço.</w:t>
-      </w:r>
-    </w:p>
-    <w:p>
-      <w:pPr>
-        <w:pBdr>
-          <w:top w:val="nil"/>
-          <w:left w:val="nil"/>
-          <w:bottom w:val="nil"/>
-          <w:right w:val="nil"/>
-          <w:between w:val="nil"/>
-        </w:pBdr>
-        <w:jc w:val="both"/>
-        <w:rPr>
-          <w:rFonts w:ascii="Times New Roman" w:hAnsi="Times New Roman" w:cs="Times New Roman"/>
-          <w:sz w:val="24"/>
-          <w:szCs w:val="24"/>
-        </w:rPr>
-      </w:pPr>
-    </w:p>
-    <w:p>
-      <w:pPr>
-        <w:pBdr>
-          <w:top w:val="nil"/>
-          <w:left w:val="nil"/>
-          <w:bottom w:val="nil"/>
-          <w:right w:val="nil"/>
-          <w:between w:val="nil"/>
-        </w:pBdr>
-        <w:jc w:val="both"/>
-        <w:rPr>
-          <w:rFonts w:ascii="Times New Roman" w:hAnsi="Times New Roman" w:cs="Times New Roman"/>
-          <w:b/>
-          <w:bCs/>
-          <w:sz w:val="24"/>
-          <w:szCs w:val="24"/>
-        </w:rPr>
-      </w:pPr>
-      <w:r>
-        <w:rPr>
-          <w:rFonts w:ascii="Times New Roman" w:hAnsi="Times New Roman" w:cs="Times New Roman"/>
-          <w:b/>
-          <w:bCs/>
-          <w:sz w:val="24"/>
-          <w:szCs w:val="24"/>
-        </w:rPr>
-        <w:t>Prioridade: [X</w:t>
-      </w:r>
-      <w:proofErr w:type="gramStart"/>
-      <w:r>
-        <w:rPr>
-          <w:rFonts w:ascii="Times New Roman" w:hAnsi="Times New Roman" w:cs="Times New Roman"/>
-          <w:b/>
-          <w:bCs/>
-          <w:sz w:val="24"/>
-          <w:szCs w:val="24"/>
-        </w:rPr>
-        <w:t>] Essencial</w:t>
-      </w:r>
-      <w:proofErr w:type="gramEnd"/>
+        <w:t>Prioridade: [X] Essencial</w:t>
+      </w:r>
     </w:p>
     <w:p>
       <w:pPr>
@@ -2601,25 +2434,7 @@
           <w:sz w:val="24"/>
           <w:szCs w:val="24"/>
         </w:rPr>
-        <w:t xml:space="preserve"> Interface Mobile-</w:t>
-      </w:r>
-      <w:proofErr w:type="spellStart"/>
-      <w:r>
-        <w:rPr>
-          <w:rFonts w:ascii="Times New Roman" w:hAnsi="Times New Roman" w:cs="Times New Roman"/>
-          <w:sz w:val="24"/>
-          <w:szCs w:val="24"/>
-        </w:rPr>
-        <w:t>First</w:t>
-      </w:r>
-      <w:proofErr w:type="spellEnd"/>
-      <w:r>
-        <w:rPr>
-          <w:rFonts w:ascii="Times New Roman" w:hAnsi="Times New Roman" w:cs="Times New Roman"/>
-          <w:sz w:val="24"/>
-          <w:szCs w:val="24"/>
-        </w:rPr>
-        <w:t xml:space="preserve"> com padrão de ícones de ação (Visualizar, Editar, Excluir) na frente dos registros.</w:t>
+        <w:t xml:space="preserve"> Interface Mobile-First com padrão de ícones de ação (Visualizar, Editar, Excluir) na frente dos registros.</w:t>
       </w:r>
     </w:p>
     <w:p>

</xml_diff>

<commit_message>
docs: adicionado nome do desenvolvedor no cabecalho do DRE
</commit_message>
<xml_diff>
--- a/DRE UniService - Entrega Final Consolidada.docx
+++ b/DRE UniService - Entrega Final Consolidada.docx
@@ -128,6 +128,50 @@
           <w:szCs w:val="24"/>
         </w:rPr>
         <w:t>Trainee Asimov</w:t>
+      </w:r>
+    </w:p>
+    <w:p>
+      <w:pPr>
+        <w:pBdr>
+          <w:top w:val="nil"/>
+          <w:left w:val="nil"/>
+          <w:bottom w:val="nil"/>
+          <w:right w:val="nil"/>
+          <w:between w:val="nil"/>
+        </w:pBdr>
+        <w:rPr>
+          <w:rFonts w:ascii="Times New Roman" w:hAnsi="Times New Roman" w:cs="Times New Roman"/>
+          <w:sz w:val="24"/>
+          <w:szCs w:val="24"/>
+        </w:rPr>
+      </w:pPr>
+      <w:r>
+        <w:rPr>
+          <w:rFonts w:ascii="Times New Roman" w:hAnsi="Times New Roman" w:cs="Times New Roman"/>
+          <w:b/>
+          <w:bCs/>
+          <w:sz w:val="24"/>
+          <w:szCs w:val="24"/>
+        </w:rPr>
+        <w:t>Desenvolvedor</w:t>
+      </w:r>
+      <w:r>
+        <w:rPr>
+          <w:rFonts w:ascii="Times New Roman" w:hAnsi="Times New Roman" w:cs="Times New Roman"/>
+          <w:b/>
+          <w:bCs/>
+          <w:sz w:val="24"/>
+          <w:szCs w:val="24"/>
+        </w:rPr>
+        <w:t xml:space="preserve">: </w:t>
+      </w:r>
+      <w:r>
+        <w:rPr>
+          <w:rFonts w:ascii="Times New Roman" w:hAnsi="Times New Roman" w:cs="Times New Roman"/>
+          <w:sz w:val="24"/>
+          <w:szCs w:val="24"/>
+        </w:rPr>
+        <w:t>Nickolas Nicoleto Musico</w:t>
       </w:r>
     </w:p>
     <w:p>

</xml_diff>